<commit_message>
Additional Docs & OCL
</commit_message>
<xml_diff>
--- a/documentation/QuickPay_SRS.docx
+++ b/documentation/QuickPay_SRS.docx
@@ -13218,6 +13218,1165 @@
         </w:rPr>
         <w:t>/v1/auth/**</w:t>
       </w:r>
+      <w:r>
+        <w:rPr>
+          <w:rStyle w:val="HTMLCode"/>
+        </w:rPr>
+        <w:br/>
+      </w:r>
+    </w:p>
+    <w:p>
+      <w:pPr>
+        <w:pStyle w:val="Heading2"/>
+        <w:tabs>
+          <w:tab w:val="left" w:pos="916"/>
+          <w:tab w:val="left" w:pos="1832"/>
+          <w:tab w:val="left" w:pos="2748"/>
+          <w:tab w:val="left" w:pos="3664"/>
+          <w:tab w:val="left" w:pos="4580"/>
+          <w:tab w:val="left" w:pos="5496"/>
+          <w:tab w:val="left" w:pos="6412"/>
+          <w:tab w:val="left" w:pos="7328"/>
+          <w:tab w:val="left" w:pos="8244"/>
+          <w:tab w:val="left" w:pos="9160"/>
+          <w:tab w:val="left" w:pos="10076"/>
+          <w:tab w:val="left" w:pos="10992"/>
+          <w:tab w:val="left" w:pos="11908"/>
+          <w:tab w:val="left" w:pos="12824"/>
+          <w:tab w:val="left" w:pos="13740"/>
+          <w:tab w:val="left" w:pos="14656"/>
+        </w:tabs>
+        <w:rPr>
+          <w:rFonts w:ascii="Calibri" w:eastAsia="Times New Roman" w:hAnsi="Calibri" w:cs="Calibri"/>
+        </w:rPr>
+      </w:pPr>
+    </w:p>
+    <w:p>
+      <w:pPr>
+        <w:pStyle w:val="Heading2"/>
+        <w:tabs>
+          <w:tab w:val="left" w:pos="916"/>
+          <w:tab w:val="left" w:pos="1832"/>
+          <w:tab w:val="left" w:pos="2748"/>
+          <w:tab w:val="left" w:pos="3664"/>
+          <w:tab w:val="left" w:pos="4580"/>
+          <w:tab w:val="left" w:pos="5496"/>
+          <w:tab w:val="left" w:pos="6412"/>
+          <w:tab w:val="left" w:pos="7328"/>
+          <w:tab w:val="left" w:pos="8244"/>
+          <w:tab w:val="left" w:pos="9160"/>
+          <w:tab w:val="left" w:pos="10076"/>
+          <w:tab w:val="left" w:pos="10992"/>
+          <w:tab w:val="left" w:pos="11908"/>
+          <w:tab w:val="left" w:pos="12824"/>
+          <w:tab w:val="left" w:pos="13740"/>
+          <w:tab w:val="left" w:pos="14656"/>
+        </w:tabs>
+        <w:rPr>
+          <w:rFonts w:ascii="Calibri" w:eastAsia="Times New Roman" w:hAnsi="Calibri" w:cs="Calibri"/>
+        </w:rPr>
+      </w:pPr>
+    </w:p>
+    <w:p>
+      <w:pPr>
+        <w:pStyle w:val="Heading2"/>
+        <w:tabs>
+          <w:tab w:val="left" w:pos="916"/>
+          <w:tab w:val="left" w:pos="1832"/>
+          <w:tab w:val="left" w:pos="2748"/>
+          <w:tab w:val="left" w:pos="3664"/>
+          <w:tab w:val="left" w:pos="4580"/>
+          <w:tab w:val="left" w:pos="5496"/>
+          <w:tab w:val="left" w:pos="6412"/>
+          <w:tab w:val="left" w:pos="7328"/>
+          <w:tab w:val="left" w:pos="8244"/>
+          <w:tab w:val="left" w:pos="9160"/>
+          <w:tab w:val="left" w:pos="10076"/>
+          <w:tab w:val="left" w:pos="10992"/>
+          <w:tab w:val="left" w:pos="11908"/>
+          <w:tab w:val="left" w:pos="12824"/>
+          <w:tab w:val="left" w:pos="13740"/>
+          <w:tab w:val="left" w:pos="14656"/>
+        </w:tabs>
+        <w:rPr>
+          <w:rFonts w:ascii="Calibri" w:eastAsia="Times New Roman" w:hAnsi="Calibri" w:cs="Calibri"/>
+        </w:rPr>
+      </w:pPr>
+    </w:p>
+    <w:p>
+      <w:pPr>
+        <w:pStyle w:val="Heading2"/>
+        <w:tabs>
+          <w:tab w:val="left" w:pos="916"/>
+          <w:tab w:val="left" w:pos="1832"/>
+          <w:tab w:val="left" w:pos="2748"/>
+          <w:tab w:val="left" w:pos="3664"/>
+          <w:tab w:val="left" w:pos="4580"/>
+          <w:tab w:val="left" w:pos="5496"/>
+          <w:tab w:val="left" w:pos="6412"/>
+          <w:tab w:val="left" w:pos="7328"/>
+          <w:tab w:val="left" w:pos="8244"/>
+          <w:tab w:val="left" w:pos="9160"/>
+          <w:tab w:val="left" w:pos="10076"/>
+          <w:tab w:val="left" w:pos="10992"/>
+          <w:tab w:val="left" w:pos="11908"/>
+          <w:tab w:val="left" w:pos="12824"/>
+          <w:tab w:val="left" w:pos="13740"/>
+          <w:tab w:val="left" w:pos="14656"/>
+        </w:tabs>
+        <w:rPr>
+          <w:rFonts w:ascii="Calibri" w:eastAsia="Times New Roman" w:hAnsi="Calibri" w:cs="Calibri"/>
+        </w:rPr>
+      </w:pPr>
+      <w:r>
+        <w:rPr>
+          <w:rFonts w:ascii="Calibri" w:eastAsia="Times New Roman" w:hAnsi="Calibri" w:cs="Calibri"/>
+        </w:rPr>
+        <w:lastRenderedPageBreak/>
+        <w:t>8</w:t>
+      </w:r>
+      <w:r>
+        <w:rPr>
+          <w:rFonts w:ascii="Calibri" w:eastAsia="Times New Roman" w:hAnsi="Calibri" w:cs="Calibri"/>
+        </w:rPr>
+        <w:t xml:space="preserve">. </w:t>
+      </w:r>
+      <w:r>
+        <w:rPr>
+          <w:rFonts w:ascii="Calibri" w:eastAsia="Times New Roman" w:hAnsi="Calibri" w:cs="Calibri"/>
+        </w:rPr>
+        <w:t>OCL</w:t>
+      </w:r>
+    </w:p>
+    <w:p>
+      <w:pPr>
+        <w:pStyle w:val="Heading3"/>
+        <w:tabs>
+          <w:tab w:val="left" w:pos="916"/>
+          <w:tab w:val="left" w:pos="1832"/>
+          <w:tab w:val="left" w:pos="2748"/>
+          <w:tab w:val="left" w:pos="3664"/>
+          <w:tab w:val="left" w:pos="4580"/>
+          <w:tab w:val="left" w:pos="5496"/>
+          <w:tab w:val="left" w:pos="6412"/>
+          <w:tab w:val="left" w:pos="7328"/>
+          <w:tab w:val="left" w:pos="8244"/>
+          <w:tab w:val="left" w:pos="9160"/>
+          <w:tab w:val="left" w:pos="10076"/>
+          <w:tab w:val="left" w:pos="10992"/>
+          <w:tab w:val="left" w:pos="11908"/>
+          <w:tab w:val="left" w:pos="12824"/>
+          <w:tab w:val="left" w:pos="13740"/>
+          <w:tab w:val="left" w:pos="14656"/>
+        </w:tabs>
+        <w:rPr>
+          <w:rFonts w:ascii="Calibri" w:eastAsia="Times New Roman" w:hAnsi="Calibri" w:cs="Calibri"/>
+        </w:rPr>
+      </w:pPr>
+      <w:r>
+        <w:rPr>
+          <w:rFonts w:ascii="Calibri" w:eastAsia="Times New Roman" w:hAnsi="Calibri" w:cs="Calibri"/>
+        </w:rPr>
+        <w:t>8</w:t>
+      </w:r>
+      <w:r>
+        <w:rPr>
+          <w:rFonts w:ascii="Calibri" w:eastAsia="Times New Roman" w:hAnsi="Calibri" w:cs="Calibri"/>
+        </w:rPr>
+        <w:t>.</w:t>
+      </w:r>
+      <w:r>
+        <w:rPr>
+          <w:rFonts w:ascii="Calibri" w:eastAsia="Times New Roman" w:hAnsi="Calibri" w:cs="Calibri"/>
+        </w:rPr>
+        <w:t>1</w:t>
+      </w:r>
+      <w:r>
+        <w:rPr>
+          <w:rFonts w:ascii="Calibri" w:eastAsia="Times New Roman" w:hAnsi="Calibri" w:cs="Calibri"/>
+        </w:rPr>
+        <w:t xml:space="preserve"> </w:t>
+      </w:r>
+      <w:r>
+        <w:rPr>
+          <w:rFonts w:ascii="Calibri" w:eastAsia="Times New Roman" w:hAnsi="Calibri" w:cs="Calibri"/>
+        </w:rPr>
+        <w:t>Wallet Context</w:t>
+      </w:r>
+    </w:p>
+    <w:p>
+      <w:pPr>
+        <w:numPr>
+          <w:ilvl w:val="0"/>
+          <w:numId w:val="11"/>
+        </w:numPr>
+        <w:spacing w:before="100" w:beforeAutospacing="1" w:after="100" w:afterAutospacing="1"/>
+        <w:rPr>
+          <w:rFonts w:ascii="Calibri" w:eastAsia="Times New Roman" w:hAnsi="Calibri" w:cs="Calibri"/>
+          <w:sz w:val="22"/>
+          <w:szCs w:val="22"/>
+        </w:rPr>
+      </w:pPr>
+      <w:r>
+        <w:rPr>
+          <w:rFonts w:ascii="Calibri" w:eastAsia="Times New Roman" w:hAnsi="Calibri" w:cs="Calibri"/>
+          <w:sz w:val="22"/>
+          <w:szCs w:val="22"/>
+        </w:rPr>
+        <w:t xml:space="preserve">-- The </w:t>
+      </w:r>
+      <w:proofErr w:type="spellStart"/>
+      <w:r>
+        <w:rPr>
+          <w:rFonts w:ascii="Calibri" w:eastAsia="Times New Roman" w:hAnsi="Calibri" w:cs="Calibri"/>
+          <w:sz w:val="22"/>
+          <w:szCs w:val="22"/>
+        </w:rPr>
+        <w:t>userId</w:t>
+      </w:r>
+      <w:proofErr w:type="spellEnd"/>
+      <w:r>
+        <w:rPr>
+          <w:rFonts w:ascii="Calibri" w:eastAsia="Times New Roman" w:hAnsi="Calibri" w:cs="Calibri"/>
+          <w:sz w:val="22"/>
+          <w:szCs w:val="22"/>
+        </w:rPr>
+        <w:t xml:space="preserve"> cannot be null (translates 'nullable = false')</w:t>
+      </w:r>
+    </w:p>
+    <w:p>
+      <w:pPr>
+        <w:numPr>
+          <w:ilvl w:val="0"/>
+          <w:numId w:val="11"/>
+        </w:numPr>
+        <w:spacing w:before="100" w:beforeAutospacing="1" w:after="100" w:afterAutospacing="1"/>
+        <w:rPr>
+          <w:rFonts w:ascii="Calibri" w:eastAsia="Times New Roman" w:hAnsi="Calibri" w:cs="Calibri"/>
+          <w:sz w:val="22"/>
+          <w:szCs w:val="22"/>
+        </w:rPr>
+      </w:pPr>
+      <w:r>
+        <w:rPr>
+          <w:rFonts w:ascii="Calibri" w:eastAsia="Times New Roman" w:hAnsi="Calibri" w:cs="Calibri"/>
+          <w:sz w:val="22"/>
+          <w:szCs w:val="22"/>
+        </w:rPr>
+        <w:t xml:space="preserve">inv </w:t>
+      </w:r>
+      <w:proofErr w:type="spellStart"/>
+      <w:r>
+        <w:rPr>
+          <w:rFonts w:ascii="Calibri" w:eastAsia="Times New Roman" w:hAnsi="Calibri" w:cs="Calibri"/>
+          <w:sz w:val="22"/>
+          <w:szCs w:val="22"/>
+        </w:rPr>
+        <w:t>UserIdNotNull</w:t>
+      </w:r>
+      <w:proofErr w:type="spellEnd"/>
+      <w:r>
+        <w:rPr>
+          <w:rFonts w:ascii="Calibri" w:eastAsia="Times New Roman" w:hAnsi="Calibri" w:cs="Calibri"/>
+          <w:sz w:val="22"/>
+          <w:szCs w:val="22"/>
+        </w:rPr>
+        <w:t xml:space="preserve">: </w:t>
+      </w:r>
+      <w:proofErr w:type="spellStart"/>
+      <w:proofErr w:type="gramStart"/>
+      <w:r>
+        <w:rPr>
+          <w:rFonts w:ascii="Calibri" w:eastAsia="Times New Roman" w:hAnsi="Calibri" w:cs="Calibri"/>
+          <w:sz w:val="22"/>
+          <w:szCs w:val="22"/>
+        </w:rPr>
+        <w:t>self.userId</w:t>
+      </w:r>
+      <w:proofErr w:type="spellEnd"/>
+      <w:proofErr w:type="gramEnd"/>
+      <w:r>
+        <w:rPr>
+          <w:rFonts w:ascii="Calibri" w:eastAsia="Times New Roman" w:hAnsi="Calibri" w:cs="Calibri"/>
+          <w:sz w:val="22"/>
+          <w:szCs w:val="22"/>
+        </w:rPr>
+        <w:t xml:space="preserve"> &lt;&gt; null</w:t>
+      </w:r>
+    </w:p>
+    <w:p>
+      <w:pPr>
+        <w:numPr>
+          <w:ilvl w:val="0"/>
+          <w:numId w:val="11"/>
+        </w:numPr>
+        <w:spacing w:before="100" w:beforeAutospacing="1" w:after="100" w:afterAutospacing="1"/>
+        <w:rPr>
+          <w:rFonts w:ascii="Calibri" w:eastAsia="Times New Roman" w:hAnsi="Calibri" w:cs="Calibri"/>
+          <w:sz w:val="22"/>
+          <w:szCs w:val="22"/>
+        </w:rPr>
+      </w:pPr>
+    </w:p>
+    <w:p>
+      <w:pPr>
+        <w:numPr>
+          <w:ilvl w:val="0"/>
+          <w:numId w:val="11"/>
+        </w:numPr>
+        <w:spacing w:before="100" w:beforeAutospacing="1" w:after="100" w:afterAutospacing="1"/>
+        <w:rPr>
+          <w:rFonts w:ascii="Calibri" w:eastAsia="Times New Roman" w:hAnsi="Calibri" w:cs="Calibri"/>
+          <w:sz w:val="22"/>
+          <w:szCs w:val="22"/>
+        </w:rPr>
+      </w:pPr>
+      <w:r>
+        <w:rPr>
+          <w:rFonts w:ascii="Calibri" w:eastAsia="Times New Roman" w:hAnsi="Calibri" w:cs="Calibri"/>
+          <w:sz w:val="22"/>
+          <w:szCs w:val="22"/>
+        </w:rPr>
+        <w:t xml:space="preserve">-- The </w:t>
+      </w:r>
+      <w:proofErr w:type="spellStart"/>
+      <w:r>
+        <w:rPr>
+          <w:rFonts w:ascii="Calibri" w:eastAsia="Times New Roman" w:hAnsi="Calibri" w:cs="Calibri"/>
+          <w:sz w:val="22"/>
+          <w:szCs w:val="22"/>
+        </w:rPr>
+        <w:t>userId</w:t>
+      </w:r>
+      <w:proofErr w:type="spellEnd"/>
+      <w:r>
+        <w:rPr>
+          <w:rFonts w:ascii="Calibri" w:eastAsia="Times New Roman" w:hAnsi="Calibri" w:cs="Calibri"/>
+          <w:sz w:val="22"/>
+          <w:szCs w:val="22"/>
+        </w:rPr>
+        <w:t xml:space="preserve"> must be unique across all wallets (translates 'unique = true')</w:t>
+      </w:r>
+    </w:p>
+    <w:p>
+      <w:pPr>
+        <w:numPr>
+          <w:ilvl w:val="0"/>
+          <w:numId w:val="11"/>
+        </w:numPr>
+        <w:spacing w:before="100" w:beforeAutospacing="1" w:after="100" w:afterAutospacing="1"/>
+        <w:rPr>
+          <w:rFonts w:ascii="Calibri" w:eastAsia="Times New Roman" w:hAnsi="Calibri" w:cs="Calibri"/>
+          <w:sz w:val="22"/>
+          <w:szCs w:val="22"/>
+        </w:rPr>
+      </w:pPr>
+      <w:r>
+        <w:rPr>
+          <w:rFonts w:ascii="Calibri" w:eastAsia="Times New Roman" w:hAnsi="Calibri" w:cs="Calibri"/>
+          <w:sz w:val="22"/>
+          <w:szCs w:val="22"/>
+        </w:rPr>
+        <w:t xml:space="preserve">inv </w:t>
+      </w:r>
+      <w:proofErr w:type="spellStart"/>
+      <w:r>
+        <w:rPr>
+          <w:rFonts w:ascii="Calibri" w:eastAsia="Times New Roman" w:hAnsi="Calibri" w:cs="Calibri"/>
+          <w:sz w:val="22"/>
+          <w:szCs w:val="22"/>
+        </w:rPr>
+        <w:t>UniqueUserId</w:t>
+      </w:r>
+      <w:proofErr w:type="spellEnd"/>
+      <w:r>
+        <w:rPr>
+          <w:rFonts w:ascii="Calibri" w:eastAsia="Times New Roman" w:hAnsi="Calibri" w:cs="Calibri"/>
+          <w:sz w:val="22"/>
+          <w:szCs w:val="22"/>
+        </w:rPr>
+        <w:t xml:space="preserve">: </w:t>
+      </w:r>
+      <w:proofErr w:type="spellStart"/>
+      <w:r>
+        <w:rPr>
+          <w:rFonts w:ascii="Calibri" w:eastAsia="Times New Roman" w:hAnsi="Calibri" w:cs="Calibri"/>
+          <w:sz w:val="22"/>
+          <w:szCs w:val="22"/>
+        </w:rPr>
+        <w:t>Wallet.allInstances</w:t>
+      </w:r>
+      <w:proofErr w:type="spellEnd"/>
+      <w:r>
+        <w:rPr>
+          <w:rFonts w:ascii="Calibri" w:eastAsia="Times New Roman" w:hAnsi="Calibri" w:cs="Calibri"/>
+          <w:sz w:val="22"/>
+          <w:szCs w:val="22"/>
+        </w:rPr>
+        <w:t>()-&gt;</w:t>
+      </w:r>
+      <w:proofErr w:type="spellStart"/>
+      <w:r>
+        <w:rPr>
+          <w:rFonts w:ascii="Calibri" w:eastAsia="Times New Roman" w:hAnsi="Calibri" w:cs="Calibri"/>
+          <w:sz w:val="22"/>
+          <w:szCs w:val="22"/>
+        </w:rPr>
+        <w:t>isUnique</w:t>
+      </w:r>
+      <w:proofErr w:type="spellEnd"/>
+      <w:r>
+        <w:rPr>
+          <w:rFonts w:ascii="Calibri" w:eastAsia="Times New Roman" w:hAnsi="Calibri" w:cs="Calibri"/>
+          <w:sz w:val="22"/>
+          <w:szCs w:val="22"/>
+        </w:rPr>
+        <w:t>(</w:t>
+      </w:r>
+      <w:proofErr w:type="spellStart"/>
+      <w:r>
+        <w:rPr>
+          <w:rFonts w:ascii="Calibri" w:eastAsia="Times New Roman" w:hAnsi="Calibri" w:cs="Calibri"/>
+          <w:sz w:val="22"/>
+          <w:szCs w:val="22"/>
+        </w:rPr>
+        <w:t>userId</w:t>
+      </w:r>
+      <w:proofErr w:type="spellEnd"/>
+      <w:r>
+        <w:rPr>
+          <w:rFonts w:ascii="Calibri" w:eastAsia="Times New Roman" w:hAnsi="Calibri" w:cs="Calibri"/>
+          <w:sz w:val="22"/>
+          <w:szCs w:val="22"/>
+        </w:rPr>
+        <w:t>)</w:t>
+      </w:r>
+    </w:p>
+    <w:p>
+      <w:pPr>
+        <w:numPr>
+          <w:ilvl w:val="0"/>
+          <w:numId w:val="11"/>
+        </w:numPr>
+        <w:spacing w:before="100" w:beforeAutospacing="1" w:after="100" w:afterAutospacing="1"/>
+        <w:rPr>
+          <w:rFonts w:ascii="Calibri" w:eastAsia="Times New Roman" w:hAnsi="Calibri" w:cs="Calibri"/>
+          <w:sz w:val="22"/>
+          <w:szCs w:val="22"/>
+        </w:rPr>
+      </w:pPr>
+    </w:p>
+    <w:p>
+      <w:pPr>
+        <w:numPr>
+          <w:ilvl w:val="0"/>
+          <w:numId w:val="11"/>
+        </w:numPr>
+        <w:spacing w:before="100" w:beforeAutospacing="1" w:after="100" w:afterAutospacing="1"/>
+        <w:rPr>
+          <w:rFonts w:ascii="Calibri" w:eastAsia="Times New Roman" w:hAnsi="Calibri" w:cs="Calibri"/>
+          <w:sz w:val="22"/>
+          <w:szCs w:val="22"/>
+        </w:rPr>
+      </w:pPr>
+      <w:r>
+        <w:rPr>
+          <w:rFonts w:ascii="Calibri" w:eastAsia="Times New Roman" w:hAnsi="Calibri" w:cs="Calibri"/>
+          <w:sz w:val="22"/>
+          <w:szCs w:val="22"/>
+        </w:rPr>
+        <w:t>-- The balance must never drop below zero (Standard financial business rule)</w:t>
+      </w:r>
+    </w:p>
+    <w:p>
+      <w:pPr>
+        <w:numPr>
+          <w:ilvl w:val="0"/>
+          <w:numId w:val="11"/>
+        </w:numPr>
+        <w:spacing w:before="100" w:beforeAutospacing="1" w:after="100" w:afterAutospacing="1"/>
+        <w:rPr>
+          <w:rFonts w:ascii="Calibri" w:eastAsia="Times New Roman" w:hAnsi="Calibri" w:cs="Calibri"/>
+          <w:sz w:val="22"/>
+          <w:szCs w:val="22"/>
+        </w:rPr>
+      </w:pPr>
+      <w:r>
+        <w:rPr>
+          <w:rFonts w:ascii="Calibri" w:eastAsia="Times New Roman" w:hAnsi="Calibri" w:cs="Calibri"/>
+          <w:sz w:val="22"/>
+          <w:szCs w:val="22"/>
+        </w:rPr>
+        <w:t xml:space="preserve">inv </w:t>
+      </w:r>
+      <w:proofErr w:type="spellStart"/>
+      <w:r>
+        <w:rPr>
+          <w:rFonts w:ascii="Calibri" w:eastAsia="Times New Roman" w:hAnsi="Calibri" w:cs="Calibri"/>
+          <w:sz w:val="22"/>
+          <w:szCs w:val="22"/>
+        </w:rPr>
+        <w:t>NonNegativeBalance</w:t>
+      </w:r>
+      <w:proofErr w:type="spellEnd"/>
+      <w:r>
+        <w:rPr>
+          <w:rFonts w:ascii="Calibri" w:eastAsia="Times New Roman" w:hAnsi="Calibri" w:cs="Calibri"/>
+          <w:sz w:val="22"/>
+          <w:szCs w:val="22"/>
+        </w:rPr>
+        <w:t xml:space="preserve">: </w:t>
+      </w:r>
+      <w:proofErr w:type="spellStart"/>
+      <w:proofErr w:type="gramStart"/>
+      <w:r>
+        <w:rPr>
+          <w:rFonts w:ascii="Calibri" w:eastAsia="Times New Roman" w:hAnsi="Calibri" w:cs="Calibri"/>
+          <w:sz w:val="22"/>
+          <w:szCs w:val="22"/>
+        </w:rPr>
+        <w:t>self.balance</w:t>
+      </w:r>
+      <w:proofErr w:type="spellEnd"/>
+      <w:proofErr w:type="gramEnd"/>
+      <w:r>
+        <w:rPr>
+          <w:rFonts w:ascii="Calibri" w:eastAsia="Times New Roman" w:hAnsi="Calibri" w:cs="Calibri"/>
+          <w:sz w:val="22"/>
+          <w:szCs w:val="22"/>
+        </w:rPr>
+        <w:t xml:space="preserve"> &gt;= 0</w:t>
+      </w:r>
+    </w:p>
+    <w:p>
+      <w:pPr>
+        <w:pStyle w:val="Heading3"/>
+        <w:tabs>
+          <w:tab w:val="left" w:pos="916"/>
+          <w:tab w:val="left" w:pos="1832"/>
+          <w:tab w:val="left" w:pos="2748"/>
+          <w:tab w:val="left" w:pos="3664"/>
+          <w:tab w:val="left" w:pos="4580"/>
+          <w:tab w:val="left" w:pos="5496"/>
+          <w:tab w:val="left" w:pos="6412"/>
+          <w:tab w:val="left" w:pos="7328"/>
+          <w:tab w:val="left" w:pos="8244"/>
+          <w:tab w:val="left" w:pos="9160"/>
+          <w:tab w:val="left" w:pos="10076"/>
+          <w:tab w:val="left" w:pos="10992"/>
+          <w:tab w:val="left" w:pos="11908"/>
+          <w:tab w:val="left" w:pos="12824"/>
+          <w:tab w:val="left" w:pos="13740"/>
+          <w:tab w:val="left" w:pos="14656"/>
+        </w:tabs>
+        <w:rPr>
+          <w:rFonts w:ascii="Calibri" w:eastAsia="Times New Roman" w:hAnsi="Calibri" w:cs="Calibri"/>
+        </w:rPr>
+      </w:pPr>
+      <w:r>
+        <w:rPr>
+          <w:rFonts w:ascii="Calibri" w:eastAsia="Times New Roman" w:hAnsi="Calibri" w:cs="Calibri"/>
+        </w:rPr>
+        <w:t xml:space="preserve">8.1 </w:t>
+      </w:r>
+      <w:r>
+        <w:rPr>
+          <w:rFonts w:ascii="Calibri" w:eastAsia="Times New Roman" w:hAnsi="Calibri" w:cs="Calibri"/>
+        </w:rPr>
+        <w:t xml:space="preserve">Transaction </w:t>
+      </w:r>
+      <w:r>
+        <w:rPr>
+          <w:rFonts w:ascii="Calibri" w:eastAsia="Times New Roman" w:hAnsi="Calibri" w:cs="Calibri"/>
+        </w:rPr>
+        <w:t>Context</w:t>
+      </w:r>
+    </w:p>
+    <w:p>
+      <w:pPr>
+        <w:numPr>
+          <w:ilvl w:val="0"/>
+          <w:numId w:val="11"/>
+        </w:numPr>
+        <w:spacing w:before="100" w:beforeAutospacing="1" w:after="100" w:afterAutospacing="1"/>
+        <w:rPr>
+          <w:rFonts w:ascii="Calibri" w:eastAsia="Times New Roman" w:hAnsi="Calibri" w:cs="Calibri"/>
+          <w:sz w:val="22"/>
+          <w:szCs w:val="22"/>
+        </w:rPr>
+      </w:pPr>
+      <w:r>
+        <w:rPr>
+          <w:rFonts w:ascii="Calibri" w:eastAsia="Times New Roman" w:hAnsi="Calibri" w:cs="Calibri"/>
+          <w:sz w:val="22"/>
+          <w:szCs w:val="22"/>
+        </w:rPr>
+        <w:t>-- The idempotency key cannot be null (translates 'nullable = false')</w:t>
+      </w:r>
+    </w:p>
+    <w:p>
+      <w:pPr>
+        <w:numPr>
+          <w:ilvl w:val="0"/>
+          <w:numId w:val="11"/>
+        </w:numPr>
+        <w:spacing w:before="100" w:beforeAutospacing="1" w:after="100" w:afterAutospacing="1"/>
+        <w:rPr>
+          <w:rFonts w:ascii="Calibri" w:eastAsia="Times New Roman" w:hAnsi="Calibri" w:cs="Calibri"/>
+          <w:sz w:val="22"/>
+          <w:szCs w:val="22"/>
+        </w:rPr>
+      </w:pPr>
+      <w:r>
+        <w:rPr>
+          <w:rFonts w:ascii="Calibri" w:eastAsia="Times New Roman" w:hAnsi="Calibri" w:cs="Calibri"/>
+          <w:sz w:val="22"/>
+          <w:szCs w:val="22"/>
+        </w:rPr>
+        <w:t xml:space="preserve">inv </w:t>
+      </w:r>
+      <w:proofErr w:type="spellStart"/>
+      <w:r>
+        <w:rPr>
+          <w:rFonts w:ascii="Calibri" w:eastAsia="Times New Roman" w:hAnsi="Calibri" w:cs="Calibri"/>
+          <w:sz w:val="22"/>
+          <w:szCs w:val="22"/>
+        </w:rPr>
+        <w:t>IdempotencyKeyNotNull</w:t>
+      </w:r>
+      <w:proofErr w:type="spellEnd"/>
+      <w:r>
+        <w:rPr>
+          <w:rFonts w:ascii="Calibri" w:eastAsia="Times New Roman" w:hAnsi="Calibri" w:cs="Calibri"/>
+          <w:sz w:val="22"/>
+          <w:szCs w:val="22"/>
+        </w:rPr>
+        <w:t xml:space="preserve">: </w:t>
+      </w:r>
+      <w:proofErr w:type="spellStart"/>
+      <w:proofErr w:type="gramStart"/>
+      <w:r>
+        <w:rPr>
+          <w:rFonts w:ascii="Calibri" w:eastAsia="Times New Roman" w:hAnsi="Calibri" w:cs="Calibri"/>
+          <w:sz w:val="22"/>
+          <w:szCs w:val="22"/>
+        </w:rPr>
+        <w:t>self.idempotencyKey</w:t>
+      </w:r>
+      <w:proofErr w:type="spellEnd"/>
+      <w:proofErr w:type="gramEnd"/>
+      <w:r>
+        <w:rPr>
+          <w:rFonts w:ascii="Calibri" w:eastAsia="Times New Roman" w:hAnsi="Calibri" w:cs="Calibri"/>
+          <w:sz w:val="22"/>
+          <w:szCs w:val="22"/>
+        </w:rPr>
+        <w:t xml:space="preserve"> &lt;&gt; null</w:t>
+      </w:r>
+    </w:p>
+    <w:p>
+      <w:pPr>
+        <w:numPr>
+          <w:ilvl w:val="0"/>
+          <w:numId w:val="11"/>
+        </w:numPr>
+        <w:spacing w:before="100" w:beforeAutospacing="1" w:after="100" w:afterAutospacing="1"/>
+        <w:rPr>
+          <w:rFonts w:ascii="Calibri" w:eastAsia="Times New Roman" w:hAnsi="Calibri" w:cs="Calibri"/>
+          <w:sz w:val="22"/>
+          <w:szCs w:val="22"/>
+        </w:rPr>
+      </w:pPr>
+    </w:p>
+    <w:p>
+      <w:pPr>
+        <w:numPr>
+          <w:ilvl w:val="0"/>
+          <w:numId w:val="11"/>
+        </w:numPr>
+        <w:spacing w:before="100" w:beforeAutospacing="1" w:after="100" w:afterAutospacing="1"/>
+        <w:rPr>
+          <w:rFonts w:ascii="Calibri" w:eastAsia="Times New Roman" w:hAnsi="Calibri" w:cs="Calibri"/>
+          <w:sz w:val="22"/>
+          <w:szCs w:val="22"/>
+        </w:rPr>
+      </w:pPr>
+      <w:r>
+        <w:rPr>
+          <w:rFonts w:ascii="Calibri" w:eastAsia="Times New Roman" w:hAnsi="Calibri" w:cs="Calibri"/>
+          <w:sz w:val="22"/>
+          <w:szCs w:val="22"/>
+        </w:rPr>
+        <w:t>-- The idempotency key must be completely unique (translates 'unique = true')</w:t>
+      </w:r>
+    </w:p>
+    <w:p>
+      <w:pPr>
+        <w:numPr>
+          <w:ilvl w:val="0"/>
+          <w:numId w:val="11"/>
+        </w:numPr>
+        <w:spacing w:before="100" w:beforeAutospacing="1" w:after="100" w:afterAutospacing="1"/>
+        <w:rPr>
+          <w:rFonts w:ascii="Calibri" w:eastAsia="Times New Roman" w:hAnsi="Calibri" w:cs="Calibri"/>
+          <w:sz w:val="22"/>
+          <w:szCs w:val="22"/>
+        </w:rPr>
+      </w:pPr>
+      <w:r>
+        <w:rPr>
+          <w:rFonts w:ascii="Calibri" w:eastAsia="Times New Roman" w:hAnsi="Calibri" w:cs="Calibri"/>
+          <w:sz w:val="22"/>
+          <w:szCs w:val="22"/>
+        </w:rPr>
+        <w:t xml:space="preserve">inv </w:t>
+      </w:r>
+      <w:proofErr w:type="spellStart"/>
+      <w:r>
+        <w:rPr>
+          <w:rFonts w:ascii="Calibri" w:eastAsia="Times New Roman" w:hAnsi="Calibri" w:cs="Calibri"/>
+          <w:sz w:val="22"/>
+          <w:szCs w:val="22"/>
+        </w:rPr>
+        <w:t>UniqueIdempotencyKey</w:t>
+      </w:r>
+      <w:proofErr w:type="spellEnd"/>
+      <w:r>
+        <w:rPr>
+          <w:rFonts w:ascii="Calibri" w:eastAsia="Times New Roman" w:hAnsi="Calibri" w:cs="Calibri"/>
+          <w:sz w:val="22"/>
+          <w:szCs w:val="22"/>
+        </w:rPr>
+        <w:t xml:space="preserve">: </w:t>
+      </w:r>
+      <w:proofErr w:type="spellStart"/>
+      <w:r>
+        <w:rPr>
+          <w:rFonts w:ascii="Calibri" w:eastAsia="Times New Roman" w:hAnsi="Calibri" w:cs="Calibri"/>
+          <w:sz w:val="22"/>
+          <w:szCs w:val="22"/>
+        </w:rPr>
+        <w:t>Transaction.allInstances</w:t>
+      </w:r>
+      <w:proofErr w:type="spellEnd"/>
+      <w:r>
+        <w:rPr>
+          <w:rFonts w:ascii="Calibri" w:eastAsia="Times New Roman" w:hAnsi="Calibri" w:cs="Calibri"/>
+          <w:sz w:val="22"/>
+          <w:szCs w:val="22"/>
+        </w:rPr>
+        <w:t>()-&gt;</w:t>
+      </w:r>
+      <w:proofErr w:type="spellStart"/>
+      <w:r>
+        <w:rPr>
+          <w:rFonts w:ascii="Calibri" w:eastAsia="Times New Roman" w:hAnsi="Calibri" w:cs="Calibri"/>
+          <w:sz w:val="22"/>
+          <w:szCs w:val="22"/>
+        </w:rPr>
+        <w:t>isUnique</w:t>
+      </w:r>
+      <w:proofErr w:type="spellEnd"/>
+      <w:r>
+        <w:rPr>
+          <w:rFonts w:ascii="Calibri" w:eastAsia="Times New Roman" w:hAnsi="Calibri" w:cs="Calibri"/>
+          <w:sz w:val="22"/>
+          <w:szCs w:val="22"/>
+        </w:rPr>
+        <w:t>(</w:t>
+      </w:r>
+      <w:proofErr w:type="spellStart"/>
+      <w:r>
+        <w:rPr>
+          <w:rFonts w:ascii="Calibri" w:eastAsia="Times New Roman" w:hAnsi="Calibri" w:cs="Calibri"/>
+          <w:sz w:val="22"/>
+          <w:szCs w:val="22"/>
+        </w:rPr>
+        <w:t>idempotencyKey</w:t>
+      </w:r>
+      <w:proofErr w:type="spellEnd"/>
+      <w:r>
+        <w:rPr>
+          <w:rFonts w:ascii="Calibri" w:eastAsia="Times New Roman" w:hAnsi="Calibri" w:cs="Calibri"/>
+          <w:sz w:val="22"/>
+          <w:szCs w:val="22"/>
+        </w:rPr>
+        <w:t>)</w:t>
+      </w:r>
+    </w:p>
+    <w:p>
+      <w:pPr>
+        <w:numPr>
+          <w:ilvl w:val="0"/>
+          <w:numId w:val="11"/>
+        </w:numPr>
+        <w:spacing w:before="100" w:beforeAutospacing="1" w:after="100" w:afterAutospacing="1"/>
+        <w:rPr>
+          <w:rFonts w:ascii="Calibri" w:eastAsia="Times New Roman" w:hAnsi="Calibri" w:cs="Calibri"/>
+          <w:sz w:val="22"/>
+          <w:szCs w:val="22"/>
+        </w:rPr>
+      </w:pPr>
+    </w:p>
+    <w:p>
+      <w:pPr>
+        <w:numPr>
+          <w:ilvl w:val="0"/>
+          <w:numId w:val="11"/>
+        </w:numPr>
+        <w:spacing w:before="100" w:beforeAutospacing="1" w:after="100" w:afterAutospacing="1"/>
+        <w:rPr>
+          <w:rFonts w:ascii="Calibri" w:eastAsia="Times New Roman" w:hAnsi="Calibri" w:cs="Calibri"/>
+          <w:sz w:val="22"/>
+          <w:szCs w:val="22"/>
+        </w:rPr>
+      </w:pPr>
+      <w:r>
+        <w:rPr>
+          <w:rFonts w:ascii="Calibri" w:eastAsia="Times New Roman" w:hAnsi="Calibri" w:cs="Calibri"/>
+          <w:sz w:val="22"/>
+          <w:szCs w:val="22"/>
+        </w:rPr>
+        <w:t>-- The transaction amount must be greater than zero</w:t>
+      </w:r>
+    </w:p>
+    <w:p>
+      <w:pPr>
+        <w:numPr>
+          <w:ilvl w:val="0"/>
+          <w:numId w:val="11"/>
+        </w:numPr>
+        <w:spacing w:before="100" w:beforeAutospacing="1" w:after="100" w:afterAutospacing="1"/>
+        <w:rPr>
+          <w:rFonts w:ascii="Calibri" w:eastAsia="Times New Roman" w:hAnsi="Calibri" w:cs="Calibri"/>
+          <w:sz w:val="22"/>
+          <w:szCs w:val="22"/>
+        </w:rPr>
+      </w:pPr>
+      <w:r>
+        <w:rPr>
+          <w:rFonts w:ascii="Calibri" w:eastAsia="Times New Roman" w:hAnsi="Calibri" w:cs="Calibri"/>
+          <w:sz w:val="22"/>
+          <w:szCs w:val="22"/>
+        </w:rPr>
+        <w:t xml:space="preserve">inv </w:t>
+      </w:r>
+      <w:proofErr w:type="spellStart"/>
+      <w:r>
+        <w:rPr>
+          <w:rFonts w:ascii="Calibri" w:eastAsia="Times New Roman" w:hAnsi="Calibri" w:cs="Calibri"/>
+          <w:sz w:val="22"/>
+          <w:szCs w:val="22"/>
+        </w:rPr>
+        <w:t>ValidAmount</w:t>
+      </w:r>
+      <w:proofErr w:type="spellEnd"/>
+      <w:r>
+        <w:rPr>
+          <w:rFonts w:ascii="Calibri" w:eastAsia="Times New Roman" w:hAnsi="Calibri" w:cs="Calibri"/>
+          <w:sz w:val="22"/>
+          <w:szCs w:val="22"/>
+        </w:rPr>
+        <w:t xml:space="preserve">: </w:t>
+      </w:r>
+      <w:proofErr w:type="spellStart"/>
+      <w:proofErr w:type="gramStart"/>
+      <w:r>
+        <w:rPr>
+          <w:rFonts w:ascii="Calibri" w:eastAsia="Times New Roman" w:hAnsi="Calibri" w:cs="Calibri"/>
+          <w:sz w:val="22"/>
+          <w:szCs w:val="22"/>
+        </w:rPr>
+        <w:t>self.amount</w:t>
+      </w:r>
+      <w:proofErr w:type="spellEnd"/>
+      <w:proofErr w:type="gramEnd"/>
+      <w:r>
+        <w:rPr>
+          <w:rFonts w:ascii="Calibri" w:eastAsia="Times New Roman" w:hAnsi="Calibri" w:cs="Calibri"/>
+          <w:sz w:val="22"/>
+          <w:szCs w:val="22"/>
+        </w:rPr>
+        <w:t xml:space="preserve"> &gt; 0</w:t>
+      </w:r>
+    </w:p>
+    <w:p>
+      <w:pPr>
+        <w:numPr>
+          <w:ilvl w:val="0"/>
+          <w:numId w:val="11"/>
+        </w:numPr>
+        <w:spacing w:before="100" w:beforeAutospacing="1" w:after="100" w:afterAutospacing="1"/>
+        <w:rPr>
+          <w:rFonts w:ascii="Calibri" w:eastAsia="Times New Roman" w:hAnsi="Calibri" w:cs="Calibri"/>
+          <w:sz w:val="22"/>
+          <w:szCs w:val="22"/>
+        </w:rPr>
+      </w:pPr>
+    </w:p>
+    <w:p>
+      <w:pPr>
+        <w:numPr>
+          <w:ilvl w:val="0"/>
+          <w:numId w:val="11"/>
+        </w:numPr>
+        <w:spacing w:before="100" w:beforeAutospacing="1" w:after="100" w:afterAutospacing="1"/>
+        <w:rPr>
+          <w:rFonts w:ascii="Calibri" w:eastAsia="Times New Roman" w:hAnsi="Calibri" w:cs="Calibri"/>
+          <w:sz w:val="22"/>
+          <w:szCs w:val="22"/>
+        </w:rPr>
+      </w:pPr>
+      <w:r>
+        <w:rPr>
+          <w:rFonts w:ascii="Calibri" w:eastAsia="Times New Roman" w:hAnsi="Calibri" w:cs="Calibri"/>
+          <w:sz w:val="22"/>
+          <w:szCs w:val="22"/>
+        </w:rPr>
+        <w:t>-- The transaction fee cannot be negative</w:t>
+      </w:r>
+    </w:p>
+    <w:p>
+      <w:pPr>
+        <w:numPr>
+          <w:ilvl w:val="0"/>
+          <w:numId w:val="11"/>
+        </w:numPr>
+        <w:spacing w:before="100" w:beforeAutospacing="1" w:after="100" w:afterAutospacing="1"/>
+        <w:rPr>
+          <w:rFonts w:ascii="Calibri" w:eastAsia="Times New Roman" w:hAnsi="Calibri" w:cs="Calibri"/>
+          <w:sz w:val="22"/>
+          <w:szCs w:val="22"/>
+        </w:rPr>
+      </w:pPr>
+      <w:r>
+        <w:rPr>
+          <w:rFonts w:ascii="Calibri" w:eastAsia="Times New Roman" w:hAnsi="Calibri" w:cs="Calibri"/>
+          <w:sz w:val="22"/>
+          <w:szCs w:val="22"/>
+        </w:rPr>
+        <w:t xml:space="preserve">inv </w:t>
+      </w:r>
+      <w:proofErr w:type="spellStart"/>
+      <w:r>
+        <w:rPr>
+          <w:rFonts w:ascii="Calibri" w:eastAsia="Times New Roman" w:hAnsi="Calibri" w:cs="Calibri"/>
+          <w:sz w:val="22"/>
+          <w:szCs w:val="22"/>
+        </w:rPr>
+        <w:t>ValidFee</w:t>
+      </w:r>
+      <w:proofErr w:type="spellEnd"/>
+      <w:r>
+        <w:rPr>
+          <w:rFonts w:ascii="Calibri" w:eastAsia="Times New Roman" w:hAnsi="Calibri" w:cs="Calibri"/>
+          <w:sz w:val="22"/>
+          <w:szCs w:val="22"/>
+        </w:rPr>
+        <w:t xml:space="preserve">: </w:t>
+      </w:r>
+      <w:proofErr w:type="spellStart"/>
+      <w:r>
+        <w:rPr>
+          <w:rFonts w:ascii="Calibri" w:eastAsia="Times New Roman" w:hAnsi="Calibri" w:cs="Calibri"/>
+          <w:sz w:val="22"/>
+          <w:szCs w:val="22"/>
+        </w:rPr>
+        <w:t>self.fee</w:t>
+      </w:r>
+      <w:proofErr w:type="spellEnd"/>
+      <w:r>
+        <w:rPr>
+          <w:rFonts w:ascii="Calibri" w:eastAsia="Times New Roman" w:hAnsi="Calibri" w:cs="Calibri"/>
+          <w:sz w:val="22"/>
+          <w:szCs w:val="22"/>
+        </w:rPr>
+        <w:t xml:space="preserve"> &gt;= 0</w:t>
+      </w:r>
+    </w:p>
+    <w:p>
+      <w:pPr>
+        <w:numPr>
+          <w:ilvl w:val="0"/>
+          <w:numId w:val="11"/>
+        </w:numPr>
+        <w:spacing w:before="100" w:beforeAutospacing="1" w:after="100" w:afterAutospacing="1"/>
+        <w:rPr>
+          <w:rFonts w:ascii="Calibri" w:eastAsia="Times New Roman" w:hAnsi="Calibri" w:cs="Calibri"/>
+          <w:sz w:val="22"/>
+          <w:szCs w:val="22"/>
+        </w:rPr>
+      </w:pPr>
+    </w:p>
+    <w:p>
+      <w:pPr>
+        <w:numPr>
+          <w:ilvl w:val="0"/>
+          <w:numId w:val="11"/>
+        </w:numPr>
+        <w:spacing w:before="100" w:beforeAutospacing="1" w:after="100" w:afterAutospacing="1"/>
+        <w:rPr>
+          <w:rFonts w:ascii="Calibri" w:eastAsia="Times New Roman" w:hAnsi="Calibri" w:cs="Calibri"/>
+          <w:sz w:val="22"/>
+          <w:szCs w:val="22"/>
+        </w:rPr>
+      </w:pPr>
+      <w:r>
+        <w:rPr>
+          <w:rFonts w:ascii="Calibri" w:eastAsia="Times New Roman" w:hAnsi="Calibri" w:cs="Calibri"/>
+          <w:sz w:val="22"/>
+          <w:szCs w:val="22"/>
+        </w:rPr>
+        <w:t>-- If a transaction is rejected, a rejection reason must be provided</w:t>
+      </w:r>
+    </w:p>
+    <w:p>
+      <w:pPr>
+        <w:numPr>
+          <w:ilvl w:val="0"/>
+          <w:numId w:val="11"/>
+        </w:numPr>
+        <w:spacing w:before="100" w:beforeAutospacing="1" w:after="100" w:afterAutospacing="1"/>
+        <w:rPr>
+          <w:rFonts w:ascii="Calibri" w:eastAsia="Times New Roman" w:hAnsi="Calibri" w:cs="Calibri"/>
+          <w:sz w:val="22"/>
+          <w:szCs w:val="22"/>
+        </w:rPr>
+      </w:pPr>
+      <w:r>
+        <w:rPr>
+          <w:rFonts w:ascii="Calibri" w:eastAsia="Times New Roman" w:hAnsi="Calibri" w:cs="Calibri"/>
+          <w:sz w:val="22"/>
+          <w:szCs w:val="22"/>
+        </w:rPr>
+        <w:t xml:space="preserve">inv </w:t>
+      </w:r>
+      <w:proofErr w:type="spellStart"/>
+      <w:r>
+        <w:rPr>
+          <w:rFonts w:ascii="Calibri" w:eastAsia="Times New Roman" w:hAnsi="Calibri" w:cs="Calibri"/>
+          <w:sz w:val="22"/>
+          <w:szCs w:val="22"/>
+        </w:rPr>
+        <w:t>RejectionReasonRequired</w:t>
+      </w:r>
+      <w:proofErr w:type="spellEnd"/>
+      <w:r>
+        <w:rPr>
+          <w:rFonts w:ascii="Calibri" w:eastAsia="Times New Roman" w:hAnsi="Calibri" w:cs="Calibri"/>
+          <w:sz w:val="22"/>
+          <w:szCs w:val="22"/>
+        </w:rPr>
+        <w:t xml:space="preserve">: </w:t>
+      </w:r>
+    </w:p>
+    <w:p>
+      <w:pPr>
+        <w:numPr>
+          <w:ilvl w:val="0"/>
+          <w:numId w:val="11"/>
+        </w:numPr>
+        <w:spacing w:before="100" w:beforeAutospacing="1" w:after="100" w:afterAutospacing="1"/>
+        <w:rPr>
+          <w:rFonts w:ascii="Calibri" w:eastAsia="Times New Roman" w:hAnsi="Calibri" w:cs="Calibri"/>
+          <w:sz w:val="22"/>
+          <w:szCs w:val="22"/>
+        </w:rPr>
+      </w:pPr>
+      <w:r>
+        <w:rPr>
+          <w:rFonts w:ascii="Calibri" w:eastAsia="Times New Roman" w:hAnsi="Calibri" w:cs="Calibri"/>
+          <w:sz w:val="22"/>
+          <w:szCs w:val="22"/>
+        </w:rPr>
+        <w:t xml:space="preserve">    </w:t>
+      </w:r>
+      <w:proofErr w:type="spellStart"/>
+      <w:proofErr w:type="gramStart"/>
+      <w:r>
+        <w:rPr>
+          <w:rFonts w:ascii="Calibri" w:eastAsia="Times New Roman" w:hAnsi="Calibri" w:cs="Calibri"/>
+          <w:sz w:val="22"/>
+          <w:szCs w:val="22"/>
+        </w:rPr>
+        <w:t>self.status</w:t>
+      </w:r>
+      <w:proofErr w:type="spellEnd"/>
+      <w:proofErr w:type="gramEnd"/>
+      <w:r>
+        <w:rPr>
+          <w:rFonts w:ascii="Calibri" w:eastAsia="Times New Roman" w:hAnsi="Calibri" w:cs="Calibri"/>
+          <w:sz w:val="22"/>
+          <w:szCs w:val="22"/>
+        </w:rPr>
+        <w:t xml:space="preserve"> = </w:t>
+      </w:r>
+      <w:proofErr w:type="spellStart"/>
+      <w:proofErr w:type="gramStart"/>
+      <w:r>
+        <w:rPr>
+          <w:rFonts w:ascii="Calibri" w:eastAsia="Times New Roman" w:hAnsi="Calibri" w:cs="Calibri"/>
+          <w:sz w:val="22"/>
+          <w:szCs w:val="22"/>
+        </w:rPr>
+        <w:t>TransactionStatus</w:t>
+      </w:r>
+      <w:proofErr w:type="spellEnd"/>
+      <w:r>
+        <w:rPr>
+          <w:rFonts w:ascii="Calibri" w:eastAsia="Times New Roman" w:hAnsi="Calibri" w:cs="Calibri"/>
+          <w:sz w:val="22"/>
+          <w:szCs w:val="22"/>
+        </w:rPr>
+        <w:t>::</w:t>
+      </w:r>
+      <w:proofErr w:type="gramEnd"/>
+      <w:r>
+        <w:rPr>
+          <w:rFonts w:ascii="Calibri" w:eastAsia="Times New Roman" w:hAnsi="Calibri" w:cs="Calibri"/>
+          <w:sz w:val="22"/>
+          <w:szCs w:val="22"/>
+        </w:rPr>
+        <w:t xml:space="preserve">REJECTED implies </w:t>
+      </w:r>
+      <w:proofErr w:type="spellStart"/>
+      <w:proofErr w:type="gramStart"/>
+      <w:r>
+        <w:rPr>
+          <w:rFonts w:ascii="Calibri" w:eastAsia="Times New Roman" w:hAnsi="Calibri" w:cs="Calibri"/>
+          <w:sz w:val="22"/>
+          <w:szCs w:val="22"/>
+        </w:rPr>
+        <w:t>self.rejectionReason</w:t>
+      </w:r>
+      <w:proofErr w:type="spellEnd"/>
+      <w:proofErr w:type="gramEnd"/>
+      <w:r>
+        <w:rPr>
+          <w:rFonts w:ascii="Calibri" w:eastAsia="Times New Roman" w:hAnsi="Calibri" w:cs="Calibri"/>
+          <w:sz w:val="22"/>
+          <w:szCs w:val="22"/>
+        </w:rPr>
+        <w:t xml:space="preserve"> &lt;</w:t>
+      </w:r>
+      <w:proofErr w:type="gramStart"/>
+      <w:r>
+        <w:rPr>
+          <w:rFonts w:ascii="Calibri" w:eastAsia="Times New Roman" w:hAnsi="Calibri" w:cs="Calibri"/>
+          <w:sz w:val="22"/>
+          <w:szCs w:val="22"/>
+        </w:rPr>
+        <w:t xml:space="preserve">&gt; </w:t>
+      </w:r>
+      <w:r>
+        <w:rPr>
+          <w:rFonts w:ascii="Calibri" w:eastAsia="Times New Roman" w:hAnsi="Calibri" w:cs="Calibri"/>
+          <w:sz w:val="22"/>
+          <w:szCs w:val="22"/>
+        </w:rPr>
+        <w:t>''</w:t>
+      </w:r>
+      <w:proofErr w:type="gramEnd"/>
     </w:p>
     <w:p>
       <w:pPr>
@@ -14914,135 +16073,36 @@
   </w:abstractNum>
   <w:num w:numId="1" w16cid:durableId="281225749">
     <w:abstractNumId w:val="4"/>
-    <w:lvlOverride w:ilvl="0"/>
-    <w:lvlOverride w:ilvl="1"/>
-    <w:lvlOverride w:ilvl="2"/>
-    <w:lvlOverride w:ilvl="3"/>
-    <w:lvlOverride w:ilvl="4"/>
-    <w:lvlOverride w:ilvl="5"/>
-    <w:lvlOverride w:ilvl="6"/>
-    <w:lvlOverride w:ilvl="7"/>
-    <w:lvlOverride w:ilvl="8"/>
   </w:num>
   <w:num w:numId="2" w16cid:durableId="1302803695">
     <w:abstractNumId w:val="10"/>
-    <w:lvlOverride w:ilvl="0"/>
-    <w:lvlOverride w:ilvl="1"/>
-    <w:lvlOverride w:ilvl="2"/>
-    <w:lvlOverride w:ilvl="3"/>
-    <w:lvlOverride w:ilvl="4"/>
-    <w:lvlOverride w:ilvl="5"/>
-    <w:lvlOverride w:ilvl="6"/>
-    <w:lvlOverride w:ilvl="7"/>
-    <w:lvlOverride w:ilvl="8"/>
   </w:num>
   <w:num w:numId="3" w16cid:durableId="1748188393">
     <w:abstractNumId w:val="8"/>
-    <w:lvlOverride w:ilvl="0"/>
-    <w:lvlOverride w:ilvl="1"/>
-    <w:lvlOverride w:ilvl="2"/>
-    <w:lvlOverride w:ilvl="3"/>
-    <w:lvlOverride w:ilvl="4"/>
-    <w:lvlOverride w:ilvl="5"/>
-    <w:lvlOverride w:ilvl="6"/>
-    <w:lvlOverride w:ilvl="7"/>
-    <w:lvlOverride w:ilvl="8"/>
   </w:num>
   <w:num w:numId="4" w16cid:durableId="1561358063">
     <w:abstractNumId w:val="6"/>
-    <w:lvlOverride w:ilvl="0"/>
-    <w:lvlOverride w:ilvl="1"/>
-    <w:lvlOverride w:ilvl="2"/>
-    <w:lvlOverride w:ilvl="3"/>
-    <w:lvlOverride w:ilvl="4"/>
-    <w:lvlOverride w:ilvl="5"/>
-    <w:lvlOverride w:ilvl="6"/>
-    <w:lvlOverride w:ilvl="7"/>
-    <w:lvlOverride w:ilvl="8"/>
   </w:num>
   <w:num w:numId="5" w16cid:durableId="1412048436">
     <w:abstractNumId w:val="1"/>
-    <w:lvlOverride w:ilvl="0"/>
-    <w:lvlOverride w:ilvl="1"/>
-    <w:lvlOverride w:ilvl="2"/>
-    <w:lvlOverride w:ilvl="3"/>
-    <w:lvlOverride w:ilvl="4"/>
-    <w:lvlOverride w:ilvl="5"/>
-    <w:lvlOverride w:ilvl="6"/>
-    <w:lvlOverride w:ilvl="7"/>
-    <w:lvlOverride w:ilvl="8"/>
   </w:num>
   <w:num w:numId="6" w16cid:durableId="66341422">
     <w:abstractNumId w:val="2"/>
-    <w:lvlOverride w:ilvl="0"/>
-    <w:lvlOverride w:ilvl="1"/>
-    <w:lvlOverride w:ilvl="2"/>
-    <w:lvlOverride w:ilvl="3"/>
-    <w:lvlOverride w:ilvl="4"/>
-    <w:lvlOverride w:ilvl="5"/>
-    <w:lvlOverride w:ilvl="6"/>
-    <w:lvlOverride w:ilvl="7"/>
-    <w:lvlOverride w:ilvl="8"/>
   </w:num>
   <w:num w:numId="7" w16cid:durableId="1259560571">
     <w:abstractNumId w:val="0"/>
-    <w:lvlOverride w:ilvl="0"/>
-    <w:lvlOverride w:ilvl="1"/>
-    <w:lvlOverride w:ilvl="2"/>
-    <w:lvlOverride w:ilvl="3"/>
-    <w:lvlOverride w:ilvl="4"/>
-    <w:lvlOverride w:ilvl="5"/>
-    <w:lvlOverride w:ilvl="6"/>
-    <w:lvlOverride w:ilvl="7"/>
-    <w:lvlOverride w:ilvl="8"/>
   </w:num>
   <w:num w:numId="8" w16cid:durableId="2093165286">
     <w:abstractNumId w:val="5"/>
-    <w:lvlOverride w:ilvl="0"/>
-    <w:lvlOverride w:ilvl="1"/>
-    <w:lvlOverride w:ilvl="2"/>
-    <w:lvlOverride w:ilvl="3"/>
-    <w:lvlOverride w:ilvl="4"/>
-    <w:lvlOverride w:ilvl="5"/>
-    <w:lvlOverride w:ilvl="6"/>
-    <w:lvlOverride w:ilvl="7"/>
-    <w:lvlOverride w:ilvl="8"/>
   </w:num>
   <w:num w:numId="9" w16cid:durableId="1909268872">
     <w:abstractNumId w:val="9"/>
-    <w:lvlOverride w:ilvl="0"/>
-    <w:lvlOverride w:ilvl="1"/>
-    <w:lvlOverride w:ilvl="2"/>
-    <w:lvlOverride w:ilvl="3"/>
-    <w:lvlOverride w:ilvl="4"/>
-    <w:lvlOverride w:ilvl="5"/>
-    <w:lvlOverride w:ilvl="6"/>
-    <w:lvlOverride w:ilvl="7"/>
-    <w:lvlOverride w:ilvl="8"/>
   </w:num>
   <w:num w:numId="10" w16cid:durableId="1066223278">
     <w:abstractNumId w:val="3"/>
-    <w:lvlOverride w:ilvl="0"/>
-    <w:lvlOverride w:ilvl="1"/>
-    <w:lvlOverride w:ilvl="2"/>
-    <w:lvlOverride w:ilvl="3"/>
-    <w:lvlOverride w:ilvl="4"/>
-    <w:lvlOverride w:ilvl="5"/>
-    <w:lvlOverride w:ilvl="6"/>
-    <w:lvlOverride w:ilvl="7"/>
-    <w:lvlOverride w:ilvl="8"/>
   </w:num>
   <w:num w:numId="11" w16cid:durableId="704981627">
     <w:abstractNumId w:val="7"/>
-    <w:lvlOverride w:ilvl="0"/>
-    <w:lvlOverride w:ilvl="1"/>
-    <w:lvlOverride w:ilvl="2"/>
-    <w:lvlOverride w:ilvl="3"/>
-    <w:lvlOverride w:ilvl="4"/>
-    <w:lvlOverride w:ilvl="5"/>
-    <w:lvlOverride w:ilvl="6"/>
-    <w:lvlOverride w:ilvl="7"/>
-    <w:lvlOverride w:ilvl="8"/>
   </w:num>
   <w:numIdMacAtCleanup w:val="11"/>
 </w:numbering>
@@ -15510,7 +16570,6 @@
   <w:style w:type="character" w:default="1" w:styleId="DefaultParagraphFont">
     <w:name w:val="Default Paragraph Font"/>
     <w:uiPriority w:val="1"/>
-    <w:semiHidden/>
     <w:unhideWhenUsed/>
   </w:style>
   <w:style w:type="table" w:default="1" w:styleId="TableNormal">
@@ -15565,7 +16624,6 @@
     <w:basedOn w:val="DefaultParagraphFont"/>
     <w:link w:val="Heading2"/>
     <w:uiPriority w:val="9"/>
-    <w:semiHidden/>
     <w:locked/>
     <w:rPr>
       <w:rFonts w:asciiTheme="majorHAnsi" w:eastAsiaTheme="majorEastAsia" w:hAnsiTheme="majorHAnsi" w:cstheme="majorBidi" w:hint="default"/>
@@ -15579,7 +16637,6 @@
     <w:basedOn w:val="DefaultParagraphFont"/>
     <w:link w:val="Heading3"/>
     <w:uiPriority w:val="9"/>
-    <w:semiHidden/>
     <w:locked/>
     <w:rPr>
       <w:rFonts w:asciiTheme="minorHAnsi" w:eastAsiaTheme="majorEastAsia" w:hAnsiTheme="minorHAnsi" w:cstheme="majorBidi" w:hint="default"/>

</xml_diff>